<commit_message>
Added interview tree testing answers
</commit_message>
<xml_diff>
--- a/documents/IA_ID.docx
+++ b/documents/IA_ID.docx
@@ -1810,7 +1810,15 @@
                 <w:color w:val="1D2125"/>
                 <w:sz w:val="24"/>
               </w:rPr>
-              <w:t xml:space="preserve">Member 2 name </w:t>
+              <w:t>Robert Hicks Jr</w:t>
+            </w:r>
+            <w:r>
+              <w:rPr>
+                <w:rFonts w:ascii="Calibri" w:eastAsia="Calibri" w:hAnsi="Calibri" w:cs="Calibri"/>
+                <w:color w:val="1D2125"/>
+                <w:sz w:val="24"/>
+              </w:rPr>
+              <w:t xml:space="preserve"> </w:t>
             </w:r>
           </w:p>
         </w:tc>
@@ -1843,17 +1851,82 @@
           </w:tcPr>
           <w:p>
             <w:pPr>
-              <w:ind w:left="80"/>
-            </w:pPr>
-            <w:r>
-              <w:rPr>
-                <w:rFonts w:ascii="Calibri" w:eastAsia="Calibri" w:hAnsi="Calibri" w:cs="Calibri"/>
-                <w:b w:val="0"/>
-                <w:i/>
-                <w:color w:val="1D2125"/>
-                <w:sz w:val="24"/>
-              </w:rPr>
-              <w:t xml:space="preserve">Insert the time taken for each of the 5 tasks here </w:t>
+              <w:pStyle w:val="ListParagraph"/>
+              <w:numPr>
+                <w:ilvl w:val="0"/>
+                <w:numId w:val="9"/>
+              </w:numPr>
+            </w:pPr>
+            <w:r>
+              <w:rPr>
+                <w:b w:val="0"/>
+                <w:bCs/>
+              </w:rPr>
+              <w:t>1min 38secs (Reviews/Guides/Hidden Content)</w:t>
+            </w:r>
+          </w:p>
+          <w:p>
+            <w:pPr>
+              <w:pStyle w:val="ListParagraph"/>
+              <w:numPr>
+                <w:ilvl w:val="0"/>
+                <w:numId w:val="9"/>
+              </w:numPr>
+            </w:pPr>
+            <w:r>
+              <w:rPr>
+                <w:b w:val="0"/>
+                <w:bCs/>
+              </w:rPr>
+              <w:t>39secs (Game Reviews)</w:t>
+            </w:r>
+          </w:p>
+          <w:p>
+            <w:pPr>
+              <w:pStyle w:val="ListParagraph"/>
+              <w:numPr>
+                <w:ilvl w:val="0"/>
+                <w:numId w:val="9"/>
+              </w:numPr>
+            </w:pPr>
+            <w:r>
+              <w:rPr>
+                <w:b w:val="0"/>
+                <w:bCs/>
+              </w:rPr>
+              <w:t>14secs (Hardware Reviews)</w:t>
+            </w:r>
+          </w:p>
+          <w:p>
+            <w:pPr>
+              <w:pStyle w:val="ListParagraph"/>
+              <w:numPr>
+                <w:ilvl w:val="0"/>
+                <w:numId w:val="9"/>
+              </w:numPr>
+            </w:pPr>
+            <w:r>
+              <w:rPr>
+                <w:b w:val="0"/>
+                <w:bCs/>
+              </w:rPr>
+              <w:t>35secs (Xbox)</w:t>
+            </w:r>
+          </w:p>
+          <w:p>
+            <w:pPr>
+              <w:pStyle w:val="ListParagraph"/>
+              <w:numPr>
+                <w:ilvl w:val="0"/>
+                <w:numId w:val="9"/>
+              </w:numPr>
+            </w:pPr>
+            <w:r>
+              <w:rPr>
+                <w:b w:val="0"/>
+                <w:bCs/>
+              </w:rPr>
+              <w:t>1min 11secs (Achievement Guides)</w:t>
             </w:r>
           </w:p>
         </w:tc>
@@ -2219,12 +2292,7 @@
               <w:jc w:val="center"/>
             </w:pPr>
             <w:r>
-              <w:rPr>
-                <w:rFonts w:ascii="Calibri" w:eastAsia="Calibri" w:hAnsi="Calibri" w:cs="Calibri"/>
-                <w:color w:val="1D2125"/>
-                <w:sz w:val="24"/>
-              </w:rPr>
-              <w:t xml:space="preserve">Member 2 name here </w:t>
+              <w:t>Robert Hicks Jr</w:t>
             </w:r>
           </w:p>
         </w:tc>
@@ -2336,6 +2404,27 @@
               </w:rPr>
               <w:t xml:space="preserve">Did you find the pages where you thought they should?  If not, which pages were not where you expected them to be in the menu hierarchy?  </w:t>
             </w:r>
+          </w:p>
+          <w:p>
+            <w:pPr>
+              <w:spacing w:after="1" w:line="238" w:lineRule="auto"/>
+              <w:ind w:left="360"/>
+              <w:jc w:val="both"/>
+            </w:pPr>
+          </w:p>
+          <w:p>
+            <w:pPr>
+              <w:spacing w:after="1" w:line="238" w:lineRule="auto"/>
+              <w:ind w:left="360"/>
+              <w:jc w:val="both"/>
+              <w:rPr>
+                <w:rFonts w:ascii="Calibri" w:eastAsia="Calibri" w:hAnsi="Calibri" w:cs="Calibri"/>
+                <w:b w:val="0"/>
+                <w:i/>
+                <w:iCs/>
+                <w:color w:val="1D2125"/>
+              </w:rPr>
+            </w:pPr>
             <w:r>
               <w:rPr>
                 <w:rFonts w:ascii="Calibri" w:eastAsia="Calibri" w:hAnsi="Calibri" w:cs="Calibri"/>
@@ -2352,6 +2441,43 @@
               </w:rPr>
               <w:t xml:space="preserve"> </w:t>
             </w:r>
+            <w:r>
+              <w:rPr>
+                <w:rFonts w:ascii="Calibri" w:eastAsia="Calibri" w:hAnsi="Calibri" w:cs="Calibri"/>
+                <w:b w:val="0"/>
+                <w:i/>
+                <w:iCs/>
+                <w:color w:val="1D2125"/>
+              </w:rPr>
+              <w:t>I found the majority of the pages that I needed to find</w:t>
+            </w:r>
+            <w:r>
+              <w:rPr>
+                <w:rFonts w:ascii="Calibri" w:eastAsia="Calibri" w:hAnsi="Calibri" w:cs="Calibri"/>
+                <w:b w:val="0"/>
+                <w:i/>
+                <w:iCs/>
+                <w:color w:val="1D2125"/>
+              </w:rPr>
+              <w:t>;</w:t>
+            </w:r>
+            <w:r>
+              <w:rPr>
+                <w:rFonts w:ascii="Calibri" w:eastAsia="Calibri" w:hAnsi="Calibri" w:cs="Calibri"/>
+                <w:b w:val="0"/>
+                <w:i/>
+                <w:iCs/>
+                <w:color w:val="1D2125"/>
+              </w:rPr>
+              <w:t xml:space="preserve"> however, some tabs could be changed to be easier to locate the information. For example, the game lore page could be changed to character information or game backgrounds. </w:t>
+            </w:r>
+          </w:p>
+          <w:p>
+            <w:pPr>
+              <w:spacing w:after="1" w:line="238" w:lineRule="auto"/>
+              <w:ind w:left="360"/>
+              <w:jc w:val="both"/>
+            </w:pPr>
           </w:p>
           <w:p>
             <w:pPr>
@@ -2372,6 +2498,32 @@
               </w:rPr>
               <w:t>Did it take more time than you thought it would take?  If so, why do you think it took longer?</w:t>
             </w:r>
+          </w:p>
+          <w:p>
+            <w:pPr>
+              <w:spacing w:after="5" w:line="234" w:lineRule="auto"/>
+              <w:ind w:left="360"/>
+              <w:jc w:val="both"/>
+              <w:rPr>
+                <w:rFonts w:ascii="Calibri" w:eastAsia="Calibri" w:hAnsi="Calibri" w:cs="Calibri"/>
+                <w:color w:val="1D2125"/>
+                <w:sz w:val="24"/>
+              </w:rPr>
+            </w:pPr>
+          </w:p>
+          <w:p>
+            <w:pPr>
+              <w:spacing w:after="5" w:line="234" w:lineRule="auto"/>
+              <w:ind w:left="360"/>
+              <w:jc w:val="both"/>
+              <w:rPr>
+                <w:rFonts w:ascii="Calibri" w:eastAsia="Calibri" w:hAnsi="Calibri" w:cs="Calibri"/>
+                <w:b w:val="0"/>
+                <w:i/>
+                <w:iCs/>
+                <w:color w:val="1D2125"/>
+              </w:rPr>
+            </w:pPr>
             <w:r>
               <w:rPr>
                 <w:rFonts w:ascii="Calibri" w:eastAsia="Calibri" w:hAnsi="Calibri" w:cs="Calibri"/>
@@ -2388,6 +2540,47 @@
               </w:rPr>
               <w:t xml:space="preserve"> </w:t>
             </w:r>
+            <w:r>
+              <w:rPr>
+                <w:rFonts w:ascii="Calibri" w:eastAsia="Calibri" w:hAnsi="Calibri" w:cs="Calibri"/>
+                <w:b w:val="0"/>
+                <w:i/>
+                <w:iCs/>
+                <w:color w:val="1D2125"/>
+              </w:rPr>
+              <w:t xml:space="preserve">Not really, </w:t>
+            </w:r>
+            <w:r>
+              <w:rPr>
+                <w:rFonts w:ascii="Calibri" w:eastAsia="Calibri" w:hAnsi="Calibri" w:cs="Calibri"/>
+                <w:b w:val="0"/>
+                <w:i/>
+                <w:iCs/>
+                <w:color w:val="1D2125"/>
+              </w:rPr>
+              <w:t xml:space="preserve">the </w:t>
+            </w:r>
+            <w:r>
+              <w:rPr>
+                <w:rFonts w:ascii="Calibri" w:eastAsia="Calibri" w:hAnsi="Calibri" w:cs="Calibri"/>
+                <w:b w:val="0"/>
+                <w:i/>
+                <w:iCs/>
+                <w:color w:val="1D2125"/>
+              </w:rPr>
+              <w:t>majority of the titling was straightforward and easy to navigate.</w:t>
+            </w:r>
+          </w:p>
+          <w:p>
+            <w:pPr>
+              <w:spacing w:after="5" w:line="234" w:lineRule="auto"/>
+              <w:ind w:left="360"/>
+              <w:jc w:val="both"/>
+              <w:rPr>
+                <w:i/>
+                <w:iCs/>
+              </w:rPr>
+            </w:pPr>
           </w:p>
           <w:p>
             <w:pPr>
@@ -2405,6 +2598,7 @@
                 <w:color w:val="1D2125"/>
                 <w:sz w:val="24"/>
               </w:rPr>
+              <w:lastRenderedPageBreak/>
               <w:t>Were menu items labeled properly to indicate relevant resources?  If not, what was mislabeled and how would you correct it?</w:t>
             </w:r>
             <w:r>
@@ -2413,15 +2607,64 @@
                 <w:color w:val="1D2125"/>
                 <w:sz w:val="24"/>
               </w:rPr>
-              <w:t xml:space="preserve"> ANS:</w:t>
-            </w:r>
-            <w:r>
-              <w:rPr>
-                <w:rFonts w:ascii="Calibri" w:eastAsia="Calibri" w:hAnsi="Calibri" w:cs="Calibri"/>
-                <w:b w:val="0"/>
-                <w:color w:val="1D2125"/>
-              </w:rPr>
               <w:t xml:space="preserve"> </w:t>
+            </w:r>
+          </w:p>
+          <w:p>
+            <w:pPr>
+              <w:ind w:left="360"/>
+              <w:jc w:val="both"/>
+              <w:rPr>
+                <w:rFonts w:ascii="Calibri" w:eastAsia="Calibri" w:hAnsi="Calibri" w:cs="Calibri"/>
+                <w:color w:val="1D2125"/>
+                <w:sz w:val="24"/>
+              </w:rPr>
+            </w:pPr>
+          </w:p>
+          <w:p>
+            <w:pPr>
+              <w:ind w:left="360"/>
+              <w:jc w:val="both"/>
+              <w:rPr>
+                <w:i/>
+                <w:iCs/>
+              </w:rPr>
+            </w:pPr>
+            <w:r>
+              <w:rPr>
+                <w:rFonts w:ascii="Calibri" w:eastAsia="Calibri" w:hAnsi="Calibri" w:cs="Calibri"/>
+                <w:color w:val="1D2125"/>
+                <w:sz w:val="24"/>
+              </w:rPr>
+              <w:t>ANS:</w:t>
+            </w:r>
+            <w:r>
+              <w:rPr>
+                <w:rFonts w:ascii="Calibri" w:eastAsia="Calibri" w:hAnsi="Calibri" w:cs="Calibri"/>
+                <w:b w:val="0"/>
+                <w:color w:val="1D2125"/>
+              </w:rPr>
+              <w:t xml:space="preserve"> </w:t>
+            </w:r>
+            <w:r>
+              <w:rPr>
+                <w:rFonts w:ascii="Calibri" w:eastAsia="Calibri" w:hAnsi="Calibri" w:cs="Calibri"/>
+                <w:b w:val="0"/>
+                <w:i/>
+                <w:iCs/>
+                <w:color w:val="1D2125"/>
+              </w:rPr>
+              <w:t>The game lore label could have been different. I was a little confused on what lore meant</w:t>
+            </w:r>
+            <w:r>
+              <w:rPr>
+                <w:rFonts w:ascii="Calibri" w:eastAsia="Calibri" w:hAnsi="Calibri" w:cs="Calibri"/>
+                <w:b w:val="0"/>
+                <w:i/>
+                <w:iCs/>
+                <w:color w:val="1D2125"/>
+              </w:rPr>
+              <w:t>.</w:t>
             </w:r>
           </w:p>
         </w:tc>
@@ -2508,6 +2751,11 @@
           <w:p>
             <w:pPr>
               <w:ind w:left="0"/>
+              <w:rPr>
+                <w:rFonts w:ascii="Calibri" w:eastAsia="Calibri" w:hAnsi="Calibri" w:cs="Calibri"/>
+                <w:color w:val="1D2125"/>
+                <w:sz w:val="24"/>
+              </w:rPr>
             </w:pPr>
             <w:r>
               <w:rPr>
@@ -2524,15 +2772,52 @@
                 <w:color w:val="1D2125"/>
                 <w:sz w:val="24"/>
               </w:rPr>
-              <w:t xml:space="preserve"> ANS:</w:t>
-            </w:r>
-            <w:r>
-              <w:rPr>
-                <w:rFonts w:ascii="Calibri" w:eastAsia="Calibri" w:hAnsi="Calibri" w:cs="Calibri"/>
-                <w:b w:val="0"/>
-                <w:color w:val="1D2125"/>
-              </w:rPr>
               <w:t xml:space="preserve"> </w:t>
+            </w:r>
+          </w:p>
+          <w:p>
+            <w:pPr>
+              <w:ind w:left="0"/>
+              <w:rPr>
+                <w:rFonts w:ascii="Calibri" w:eastAsia="Calibri" w:hAnsi="Calibri" w:cs="Calibri"/>
+                <w:color w:val="1D2125"/>
+                <w:sz w:val="24"/>
+              </w:rPr>
+            </w:pPr>
+          </w:p>
+          <w:p>
+            <w:pPr>
+              <w:ind w:left="0"/>
+              <w:rPr>
+                <w:i/>
+                <w:iCs/>
+              </w:rPr>
+            </w:pPr>
+            <w:r>
+              <w:rPr>
+                <w:rFonts w:ascii="Calibri" w:eastAsia="Calibri" w:hAnsi="Calibri" w:cs="Calibri"/>
+                <w:color w:val="1D2125"/>
+                <w:sz w:val="24"/>
+              </w:rPr>
+              <w:t>ANS:</w:t>
+            </w:r>
+            <w:r>
+              <w:rPr>
+                <w:rFonts w:ascii="Calibri" w:eastAsia="Calibri" w:hAnsi="Calibri" w:cs="Calibri"/>
+                <w:b w:val="0"/>
+                <w:color w:val="1D2125"/>
+              </w:rPr>
+              <w:t xml:space="preserve"> </w:t>
+            </w:r>
+            <w:r>
+              <w:rPr>
+                <w:rFonts w:ascii="Calibri" w:eastAsia="Calibri" w:hAnsi="Calibri" w:cs="Calibri"/>
+                <w:b w:val="0"/>
+                <w:i/>
+                <w:iCs/>
+                <w:color w:val="1D2125"/>
+              </w:rPr>
+              <w:t>Change the page to make it user-friendly for first-time users or people who aren’t too familiar with game pages. You want to be able to cater to your target audience but also friendly enough to invite other audiences to your page as well.</w:t>
             </w:r>
           </w:p>
         </w:tc>
@@ -2659,8 +2944,6 @@
           <w:p>
             <w:pPr>
               <w:ind w:left="115"/>
-            </w:pPr>
-            <w:r>
               <w:rPr>
                 <w:rFonts w:ascii="Calibri" w:eastAsia="Calibri" w:hAnsi="Calibri" w:cs="Calibri"/>
                 <w:b w:val="0"/>
@@ -2668,9 +2951,66 @@
                 <w:color w:val="1D2125"/>
                 <w:sz w:val="24"/>
               </w:rPr>
-              <w:lastRenderedPageBreak/>
+            </w:pPr>
+            <w:r>
+              <w:rPr>
+                <w:rFonts w:ascii="Calibri" w:eastAsia="Calibri" w:hAnsi="Calibri" w:cs="Calibri"/>
+                <w:b w:val="0"/>
+                <w:i/>
+                <w:color w:val="1D2125"/>
+                <w:sz w:val="24"/>
+              </w:rPr>
               <w:t xml:space="preserve">Insert the team’s assessment of the sitemap generated based on the Tree Testing.  Include any weaknesses, strengths, and any possible modifications here. </w:t>
             </w:r>
+          </w:p>
+          <w:p>
+            <w:pPr>
+              <w:ind w:left="115"/>
+            </w:pPr>
+          </w:p>
+          <w:p>
+            <w:pPr>
+              <w:ind w:left="115"/>
+            </w:pPr>
+            <w:r>
+              <w:t>Strengths:</w:t>
+            </w:r>
+          </w:p>
+          <w:p>
+            <w:pPr>
+              <w:ind w:left="115"/>
+            </w:pPr>
+          </w:p>
+          <w:p>
+            <w:pPr>
+              <w:ind w:left="115"/>
+            </w:pPr>
+            <w:r>
+              <w:t>Weaknesses:</w:t>
+            </w:r>
+          </w:p>
+          <w:p>
+            <w:pPr>
+              <w:ind w:left="115"/>
+            </w:pPr>
+          </w:p>
+          <w:p>
+            <w:pPr>
+              <w:ind w:left="115"/>
+            </w:pPr>
+            <w:r>
+              <w:t>Modifications:</w:t>
+            </w:r>
+          </w:p>
+          <w:p>
+            <w:pPr>
+              <w:ind w:left="115"/>
+            </w:pPr>
+          </w:p>
+          <w:p>
+            <w:pPr>
+              <w:ind w:left="115"/>
+            </w:pPr>
           </w:p>
         </w:tc>
       </w:tr>
@@ -2730,7 +3070,7 @@
                 <w:color w:val="1D2125"/>
                 <w:sz w:val="24"/>
               </w:rPr>
-              <w:t xml:space="preserve">List the labels/titles the final list content/services/menu items here. </w:t>
+              <w:t xml:space="preserve">List the labels </w:t>
             </w:r>
             <w:r>
               <w:rPr>
@@ -3063,6 +3403,95 @@
     </w:lvl>
   </w:abstractNum>
   <w:abstractNum w:abstractNumId="2" w15:restartNumberingAfterBreak="0">
+    <w:nsid w:val="29FB2F1A"/>
+    <w:multiLevelType w:val="hybridMultilevel"/>
+    <w:tmpl w:val="0FA81176"/>
+    <w:lvl w:ilvl="0" w:tplc="958CBEE0">
+      <w:start w:val="1"/>
+      <w:numFmt w:val="decimal"/>
+      <w:lvlText w:val="%1."/>
+      <w:lvlJc w:val="left"/>
+      <w:pPr>
+        <w:ind w:left="440" w:hanging="360"/>
+      </w:pPr>
+      <w:rPr>
+        <w:rFonts w:hint="default"/>
+      </w:rPr>
+    </w:lvl>
+    <w:lvl w:ilvl="1" w:tplc="04090019" w:tentative="1">
+      <w:start w:val="1"/>
+      <w:numFmt w:val="lowerLetter"/>
+      <w:lvlText w:val="%2."/>
+      <w:lvlJc w:val="left"/>
+      <w:pPr>
+        <w:ind w:left="1160" w:hanging="360"/>
+      </w:pPr>
+    </w:lvl>
+    <w:lvl w:ilvl="2" w:tplc="0409001B" w:tentative="1">
+      <w:start w:val="1"/>
+      <w:numFmt w:val="lowerRoman"/>
+      <w:lvlText w:val="%3."/>
+      <w:lvlJc w:val="right"/>
+      <w:pPr>
+        <w:ind w:left="1880" w:hanging="180"/>
+      </w:pPr>
+    </w:lvl>
+    <w:lvl w:ilvl="3" w:tplc="0409000F" w:tentative="1">
+      <w:start w:val="1"/>
+      <w:numFmt w:val="decimal"/>
+      <w:lvlText w:val="%4."/>
+      <w:lvlJc w:val="left"/>
+      <w:pPr>
+        <w:ind w:left="2600" w:hanging="360"/>
+      </w:pPr>
+    </w:lvl>
+    <w:lvl w:ilvl="4" w:tplc="04090019" w:tentative="1">
+      <w:start w:val="1"/>
+      <w:numFmt w:val="lowerLetter"/>
+      <w:lvlText w:val="%5."/>
+      <w:lvlJc w:val="left"/>
+      <w:pPr>
+        <w:ind w:left="3320" w:hanging="360"/>
+      </w:pPr>
+    </w:lvl>
+    <w:lvl w:ilvl="5" w:tplc="0409001B" w:tentative="1">
+      <w:start w:val="1"/>
+      <w:numFmt w:val="lowerRoman"/>
+      <w:lvlText w:val="%6."/>
+      <w:lvlJc w:val="right"/>
+      <w:pPr>
+        <w:ind w:left="4040" w:hanging="180"/>
+      </w:pPr>
+    </w:lvl>
+    <w:lvl w:ilvl="6" w:tplc="0409000F" w:tentative="1">
+      <w:start w:val="1"/>
+      <w:numFmt w:val="decimal"/>
+      <w:lvlText w:val="%7."/>
+      <w:lvlJc w:val="left"/>
+      <w:pPr>
+        <w:ind w:left="4760" w:hanging="360"/>
+      </w:pPr>
+    </w:lvl>
+    <w:lvl w:ilvl="7" w:tplc="04090019" w:tentative="1">
+      <w:start w:val="1"/>
+      <w:numFmt w:val="lowerLetter"/>
+      <w:lvlText w:val="%8."/>
+      <w:lvlJc w:val="left"/>
+      <w:pPr>
+        <w:ind w:left="5480" w:hanging="360"/>
+      </w:pPr>
+    </w:lvl>
+    <w:lvl w:ilvl="8" w:tplc="0409001B" w:tentative="1">
+      <w:start w:val="1"/>
+      <w:numFmt w:val="lowerRoman"/>
+      <w:lvlText w:val="%9."/>
+      <w:lvlJc w:val="right"/>
+      <w:pPr>
+        <w:ind w:left="6200" w:hanging="180"/>
+      </w:pPr>
+    </w:lvl>
+  </w:abstractNum>
+  <w:abstractNum w:abstractNumId="3" w15:restartNumberingAfterBreak="0">
     <w:nsid w:val="4017652C"/>
     <w:multiLevelType w:val="hybridMultilevel"/>
     <w:tmpl w:val="D7D0D57A"/>
@@ -3175,7 +3604,7 @@
       </w:rPr>
     </w:lvl>
   </w:abstractNum>
-  <w:abstractNum w:abstractNumId="3" w15:restartNumberingAfterBreak="0">
+  <w:abstractNum w:abstractNumId="4" w15:restartNumberingAfterBreak="0">
     <w:nsid w:val="54FB5E14"/>
     <w:multiLevelType w:val="hybridMultilevel"/>
     <w:tmpl w:val="CA50099E"/>
@@ -3289,7 +3718,7 @@
       </w:rPr>
     </w:lvl>
   </w:abstractNum>
-  <w:abstractNum w:abstractNumId="4" w15:restartNumberingAfterBreak="0">
+  <w:abstractNum w:abstractNumId="5" w15:restartNumberingAfterBreak="0">
     <w:nsid w:val="58615448"/>
     <w:multiLevelType w:val="hybridMultilevel"/>
     <w:tmpl w:val="1C2E97CC"/>
@@ -3382,7 +3811,7 @@
       </w:pPr>
     </w:lvl>
   </w:abstractNum>
-  <w:abstractNum w:abstractNumId="5" w15:restartNumberingAfterBreak="0">
+  <w:abstractNum w:abstractNumId="6" w15:restartNumberingAfterBreak="0">
     <w:nsid w:val="5FB3162D"/>
     <w:multiLevelType w:val="hybridMultilevel"/>
     <w:tmpl w:val="EAB22CA4"/>
@@ -3471,7 +3900,7 @@
       </w:pPr>
     </w:lvl>
   </w:abstractNum>
-  <w:abstractNum w:abstractNumId="6" w15:restartNumberingAfterBreak="0">
+  <w:abstractNum w:abstractNumId="7" w15:restartNumberingAfterBreak="0">
     <w:nsid w:val="681D6838"/>
     <w:multiLevelType w:val="hybridMultilevel"/>
     <w:tmpl w:val="1FE28508"/>
@@ -3560,7 +3989,7 @@
       </w:pPr>
     </w:lvl>
   </w:abstractNum>
-  <w:abstractNum w:abstractNumId="7" w15:restartNumberingAfterBreak="0">
+  <w:abstractNum w:abstractNumId="8" w15:restartNumberingAfterBreak="0">
     <w:nsid w:val="7B820D77"/>
     <w:multiLevelType w:val="hybridMultilevel"/>
     <w:tmpl w:val="C1AA18D8"/>
@@ -3773,28 +4202,31 @@
     </w:lvl>
   </w:abstractNum>
   <w:num w:numId="1" w16cid:durableId="57755589">
-    <w:abstractNumId w:val="7"/>
+    <w:abstractNumId w:val="8"/>
   </w:num>
   <w:num w:numId="2" w16cid:durableId="474185449">
     <w:abstractNumId w:val="1"/>
   </w:num>
   <w:num w:numId="3" w16cid:durableId="330064531">
-    <w:abstractNumId w:val="6"/>
+    <w:abstractNumId w:val="7"/>
   </w:num>
   <w:num w:numId="4" w16cid:durableId="1329288562">
-    <w:abstractNumId w:val="2"/>
+    <w:abstractNumId w:val="3"/>
   </w:num>
   <w:num w:numId="5" w16cid:durableId="939798601">
     <w:abstractNumId w:val="0"/>
   </w:num>
   <w:num w:numId="6" w16cid:durableId="950206805">
-    <w:abstractNumId w:val="3"/>
+    <w:abstractNumId w:val="4"/>
   </w:num>
   <w:num w:numId="7" w16cid:durableId="82847711">
-    <w:abstractNumId w:val="4"/>
+    <w:abstractNumId w:val="5"/>
   </w:num>
   <w:num w:numId="8" w16cid:durableId="2055957560">
-    <w:abstractNumId w:val="5"/>
+    <w:abstractNumId w:val="6"/>
+  </w:num>
+  <w:num w:numId="9" w16cid:durableId="337469047">
+    <w:abstractNumId w:val="2"/>
   </w:num>
 </w:numbering>
 </file>

</xml_diff>

<commit_message>
added team assessment of site map and labels/titles
</commit_message>
<xml_diff>
--- a/documents/IA_ID.docx
+++ b/documents/IA_ID.docx
@@ -118,6 +118,8 @@
             <w:r>
               <w:rPr>
                 <w:rFonts w:ascii="Calibri" w:eastAsia="Calibri" w:hAnsi="Calibri" w:cs="Calibri"/>
+                <w:b w:val="0"/>
+                <w:bCs/>
                 <w:color w:val="1D2125"/>
                 <w:sz w:val="24"/>
               </w:rPr>
@@ -135,7 +137,17 @@
                 <w:color w:val="1D2125"/>
                 <w:sz w:val="24"/>
               </w:rPr>
-              <w:t>Team Name: Breaking Code</w:t>
+              <w:t xml:space="preserve">Team Name: </w:t>
+            </w:r>
+            <w:r>
+              <w:rPr>
+                <w:rFonts w:ascii="Calibri" w:eastAsia="Calibri" w:hAnsi="Calibri" w:cs="Calibri"/>
+                <w:b w:val="0"/>
+                <w:bCs/>
+                <w:color w:val="1D2125"/>
+                <w:sz w:val="24"/>
+              </w:rPr>
+              <w:t>Breaking Code</w:t>
             </w:r>
           </w:p>
           <w:p>
@@ -658,7 +670,15 @@
                 <w:color w:val="1D2125"/>
                 <w:sz w:val="24"/>
               </w:rPr>
-              <w:t xml:space="preserve">Member 1 name here </w:t>
+              <w:t>Jermaine Jackson</w:t>
+            </w:r>
+            <w:r>
+              <w:rPr>
+                <w:rFonts w:ascii="Calibri" w:eastAsia="Calibri" w:hAnsi="Calibri" w:cs="Calibri"/>
+                <w:color w:val="1D2125"/>
+                <w:sz w:val="24"/>
+              </w:rPr>
+              <w:t xml:space="preserve"> </w:t>
             </w:r>
           </w:p>
         </w:tc>
@@ -930,7 +950,15 @@
                 <w:color w:val="1D2125"/>
                 <w:sz w:val="24"/>
               </w:rPr>
-              <w:t xml:space="preserve">Member 2 name here </w:t>
+              <w:t>Robert Hicks Jr</w:t>
+            </w:r>
+            <w:r>
+              <w:rPr>
+                <w:rFonts w:ascii="Calibri" w:eastAsia="Calibri" w:hAnsi="Calibri" w:cs="Calibri"/>
+                <w:color w:val="1D2125"/>
+                <w:sz w:val="24"/>
+              </w:rPr>
+              <w:t xml:space="preserve"> </w:t>
             </w:r>
           </w:p>
         </w:tc>
@@ -1725,7 +1753,15 @@
                 <w:color w:val="1D2125"/>
                 <w:sz w:val="24"/>
               </w:rPr>
-              <w:t xml:space="preserve">Member 1 name </w:t>
+              <w:t>Jermaine Jackson</w:t>
+            </w:r>
+            <w:r>
+              <w:rPr>
+                <w:rFonts w:ascii="Calibri" w:eastAsia="Calibri" w:hAnsi="Calibri" w:cs="Calibri"/>
+                <w:color w:val="1D2125"/>
+                <w:sz w:val="24"/>
+              </w:rPr>
+              <w:t xml:space="preserve"> </w:t>
             </w:r>
           </w:p>
         </w:tc>
@@ -1758,17 +1794,116 @@
           </w:tcPr>
           <w:p>
             <w:pPr>
-              <w:ind w:left="80"/>
-            </w:pPr>
-            <w:r>
-              <w:rPr>
-                <w:rFonts w:ascii="Calibri" w:eastAsia="Calibri" w:hAnsi="Calibri" w:cs="Calibri"/>
-                <w:b w:val="0"/>
-                <w:i/>
-                <w:color w:val="1D2125"/>
-                <w:sz w:val="24"/>
-              </w:rPr>
-              <w:t xml:space="preserve">Insert the time taken for each of the 5 tasks here </w:t>
+              <w:pStyle w:val="ListParagraph"/>
+              <w:numPr>
+                <w:ilvl w:val="0"/>
+                <w:numId w:val="10"/>
+              </w:numPr>
+              <w:rPr>
+                <w:b w:val="0"/>
+                <w:bCs/>
+              </w:rPr>
+            </w:pPr>
+            <w:r>
+              <w:rPr>
+                <w:b w:val="0"/>
+                <w:bCs/>
+              </w:rPr>
+              <w:t>1min 5secs</w:t>
+            </w:r>
+            <w:r>
+              <w:rPr>
+                <w:b w:val="0"/>
+                <w:bCs/>
+              </w:rPr>
+              <w:t>(Game Lore)</w:t>
+            </w:r>
+          </w:p>
+          <w:p>
+            <w:pPr>
+              <w:pStyle w:val="ListParagraph"/>
+              <w:numPr>
+                <w:ilvl w:val="0"/>
+                <w:numId w:val="10"/>
+              </w:numPr>
+              <w:rPr>
+                <w:b w:val="0"/>
+                <w:bCs/>
+              </w:rPr>
+            </w:pPr>
+            <w:r>
+              <w:rPr>
+                <w:b w:val="0"/>
+                <w:bCs/>
+              </w:rPr>
+              <w:t>33secs</w:t>
+            </w:r>
+            <w:r>
+              <w:rPr>
+                <w:b w:val="0"/>
+                <w:bCs/>
+              </w:rPr>
+              <w:t>(YAG Discord)</w:t>
+            </w:r>
+          </w:p>
+          <w:p>
+            <w:pPr>
+              <w:pStyle w:val="ListParagraph"/>
+              <w:numPr>
+                <w:ilvl w:val="0"/>
+                <w:numId w:val="10"/>
+              </w:numPr>
+              <w:rPr>
+                <w:b w:val="0"/>
+                <w:bCs/>
+              </w:rPr>
+            </w:pPr>
+            <w:r>
+              <w:rPr>
+                <w:b w:val="0"/>
+                <w:bCs/>
+              </w:rPr>
+              <w:t>26secs(Hardware Reviews)</w:t>
+            </w:r>
+          </w:p>
+          <w:p>
+            <w:pPr>
+              <w:pStyle w:val="ListParagraph"/>
+              <w:numPr>
+                <w:ilvl w:val="0"/>
+                <w:numId w:val="10"/>
+              </w:numPr>
+              <w:rPr>
+                <w:b w:val="0"/>
+                <w:bCs/>
+              </w:rPr>
+            </w:pPr>
+            <w:r>
+              <w:rPr>
+                <w:b w:val="0"/>
+                <w:bCs/>
+              </w:rPr>
+              <w:t>1min 7secs(Xbox)</w:t>
+            </w:r>
+          </w:p>
+          <w:p>
+            <w:pPr>
+              <w:pStyle w:val="ListParagraph"/>
+              <w:numPr>
+                <w:ilvl w:val="0"/>
+                <w:numId w:val="10"/>
+              </w:numPr>
+              <w:rPr>
+                <w:b w:val="0"/>
+                <w:bCs/>
+              </w:rPr>
+            </w:pPr>
+            <w:r>
+              <w:rPr>
+                <w:b w:val="0"/>
+                <w:bCs/>
+              </w:rPr>
+              <w:t>37secs(Achievement Guides)</w:t>
             </w:r>
           </w:p>
         </w:tc>
@@ -2010,7 +2145,15 @@
                 <w:color w:val="1D2125"/>
                 <w:sz w:val="24"/>
               </w:rPr>
-              <w:t xml:space="preserve">Member 1 name here </w:t>
+              <w:t>Jermaine Jackson</w:t>
+            </w:r>
+            <w:r>
+              <w:rPr>
+                <w:rFonts w:ascii="Calibri" w:eastAsia="Calibri" w:hAnsi="Calibri" w:cs="Calibri"/>
+                <w:color w:val="1D2125"/>
+                <w:sz w:val="24"/>
+              </w:rPr>
+              <w:t xml:space="preserve"> </w:t>
             </w:r>
           </w:p>
         </w:tc>
@@ -2136,6 +2279,14 @@
               </w:rPr>
               <w:t xml:space="preserve"> </w:t>
             </w:r>
+            <w:r>
+              <w:rPr>
+                <w:rFonts w:ascii="Calibri" w:eastAsia="Calibri" w:hAnsi="Calibri" w:cs="Calibri"/>
+                <w:b w:val="0"/>
+                <w:color w:val="1D2125"/>
+              </w:rPr>
+              <w:t>I mostly found pages where they should be. Hardware could have its own dedicated section instead of being grouped into reviews.</w:t>
+            </w:r>
           </w:p>
           <w:p>
             <w:pPr>
@@ -2171,6 +2322,22 @@
               </w:rPr>
               <w:t xml:space="preserve"> </w:t>
             </w:r>
+            <w:r>
+              <w:rPr>
+                <w:rFonts w:ascii="Calibri" w:eastAsia="Calibri" w:hAnsi="Calibri" w:cs="Calibri"/>
+                <w:b w:val="0"/>
+                <w:color w:val="1D2125"/>
+              </w:rPr>
+              <w:t>No, the timing to navigate felt right</w:t>
+            </w:r>
+            <w:r>
+              <w:rPr>
+                <w:rFonts w:ascii="Calibri" w:eastAsia="Calibri" w:hAnsi="Calibri" w:cs="Calibri"/>
+                <w:b w:val="0"/>
+                <w:color w:val="1D2125"/>
+              </w:rPr>
+              <w:t>. Overall everything felt quick and easy to find.</w:t>
+            </w:r>
           </w:p>
           <w:p>
             <w:pPr>
@@ -2206,6 +2373,30 @@
               </w:rPr>
               <w:t xml:space="preserve"> </w:t>
             </w:r>
+            <w:r>
+              <w:rPr>
+                <w:rFonts w:ascii="Calibri" w:eastAsia="Calibri" w:hAnsi="Calibri" w:cs="Calibri"/>
+                <w:b w:val="0"/>
+                <w:color w:val="1D2125"/>
+              </w:rPr>
+              <w:t>For the most part yes. The only thing I could suggest is adding specs to the hardware reviews</w:t>
+            </w:r>
+            <w:r>
+              <w:rPr>
+                <w:rFonts w:ascii="Calibri" w:eastAsia="Calibri" w:hAnsi="Calibri" w:cs="Calibri"/>
+                <w:b w:val="0"/>
+                <w:color w:val="1D2125"/>
+              </w:rPr>
+              <w:t xml:space="preserve"> label</w:t>
+            </w:r>
+            <w:r>
+              <w:rPr>
+                <w:rFonts w:ascii="Calibri" w:eastAsia="Calibri" w:hAnsi="Calibri" w:cs="Calibri"/>
+                <w:b w:val="0"/>
+                <w:color w:val="1D2125"/>
+              </w:rPr>
+              <w:t>.</w:t>
+            </w:r>
           </w:p>
           <w:p>
             <w:pPr>
@@ -2239,6 +2430,14 @@
                 <w:color w:val="1D2125"/>
               </w:rPr>
               <w:t xml:space="preserve"> </w:t>
+            </w:r>
+            <w:r>
+              <w:rPr>
+                <w:rFonts w:ascii="Calibri" w:eastAsia="Calibri" w:hAnsi="Calibri" w:cs="Calibri"/>
+                <w:b w:val="0"/>
+                <w:color w:val="1D2125"/>
+              </w:rPr>
+              <w:t>Maybe merging walkthroughs and guides these pages are similar and content could overlap.</w:t>
             </w:r>
           </w:p>
         </w:tc>
@@ -2598,7 +2797,6 @@
                 <w:color w:val="1D2125"/>
                 <w:sz w:val="24"/>
               </w:rPr>
-              <w:lastRenderedPageBreak/>
               <w:t>Were menu items labeled properly to indicate relevant resources?  If not, what was mislabeled and how would you correct it?</w:t>
             </w:r>
             <w:r>
@@ -2978,28 +3176,275 @@
           </w:p>
           <w:p>
             <w:pPr>
+              <w:pStyle w:val="ListParagraph"/>
+              <w:numPr>
+                <w:ilvl w:val="0"/>
+                <w:numId w:val="4"/>
+              </w:numPr>
+              <w:rPr>
+                <w:b w:val="0"/>
+                <w:bCs/>
+              </w:rPr>
+            </w:pPr>
+            <w:r>
+              <w:rPr>
+                <w:b w:val="0"/>
+                <w:bCs/>
+              </w:rPr>
+              <w:t>Labels/Titles for the most part are clear and concise</w:t>
+            </w:r>
+          </w:p>
+          <w:p>
+            <w:pPr>
+              <w:pStyle w:val="ListParagraph"/>
+              <w:numPr>
+                <w:ilvl w:val="0"/>
+                <w:numId w:val="4"/>
+              </w:numPr>
+              <w:rPr>
+                <w:b w:val="0"/>
+                <w:bCs/>
+              </w:rPr>
+            </w:pPr>
+            <w:r>
+              <w:rPr>
+                <w:b w:val="0"/>
+                <w:bCs/>
+              </w:rPr>
+              <w:t>Additional labels/titles are logically grouped and make sense together</w:t>
+            </w:r>
+          </w:p>
+          <w:p>
+            <w:pPr>
+              <w:pStyle w:val="ListParagraph"/>
+              <w:numPr>
+                <w:ilvl w:val="0"/>
+                <w:numId w:val="4"/>
+              </w:numPr>
+              <w:rPr>
+                <w:b w:val="0"/>
+                <w:bCs/>
+              </w:rPr>
+            </w:pPr>
+            <w:r>
+              <w:rPr>
+                <w:b w:val="0"/>
+                <w:bCs/>
+              </w:rPr>
+              <w:t>Navigation is straightforward and easy to find pages</w:t>
+            </w:r>
+          </w:p>
+          <w:p>
+            <w:pPr>
               <w:ind w:left="115"/>
             </w:pPr>
+            <w:r>
+              <w:t>Weaknesses:</w:t>
+            </w:r>
+          </w:p>
+          <w:p>
+            <w:pPr>
+              <w:pStyle w:val="ListParagraph"/>
+              <w:numPr>
+                <w:ilvl w:val="0"/>
+                <w:numId w:val="11"/>
+              </w:numPr>
+              <w:rPr>
+                <w:b w:val="0"/>
+                <w:bCs/>
+              </w:rPr>
+            </w:pPr>
+            <w:r>
+              <w:rPr>
+                <w:b w:val="0"/>
+                <w:bCs/>
+              </w:rPr>
+              <w:t>Some tabs labels/titles are confusing or unclear</w:t>
+            </w:r>
+          </w:p>
+          <w:p>
+            <w:pPr>
+              <w:pStyle w:val="ListParagraph"/>
+              <w:numPr>
+                <w:ilvl w:val="0"/>
+                <w:numId w:val="11"/>
+              </w:numPr>
+              <w:rPr>
+                <w:b w:val="0"/>
+                <w:bCs/>
+              </w:rPr>
+            </w:pPr>
+            <w:r>
+              <w:rPr>
+                <w:b w:val="0"/>
+                <w:bCs/>
+              </w:rPr>
+              <w:t>Pages could be more user friendly for first time users or people who are too fam</w:t>
+            </w:r>
+            <w:r>
+              <w:rPr>
+                <w:b w:val="0"/>
+                <w:bCs/>
+              </w:rPr>
+              <w:t>iliar with gaming websites.</w:t>
+            </w:r>
           </w:p>
           <w:p>
             <w:pPr>
               <w:ind w:left="115"/>
             </w:pPr>
             <w:r>
-              <w:t>Weaknesses:</w:t>
-            </w:r>
-          </w:p>
-          <w:p>
-            <w:pPr>
-              <w:ind w:left="115"/>
-            </w:pPr>
-          </w:p>
-          <w:p>
-            <w:pPr>
-              <w:ind w:left="115"/>
-            </w:pPr>
-            <w:r>
               <w:t>Modifications:</w:t>
+            </w:r>
+          </w:p>
+          <w:p>
+            <w:pPr>
+              <w:pStyle w:val="ListParagraph"/>
+              <w:numPr>
+                <w:ilvl w:val="0"/>
+                <w:numId w:val="12"/>
+              </w:numPr>
+              <w:rPr>
+                <w:b w:val="0"/>
+                <w:bCs/>
+              </w:rPr>
+            </w:pPr>
+            <w:r>
+              <w:rPr>
+                <w:b w:val="0"/>
+                <w:bCs/>
+              </w:rPr>
+              <w:t>Change</w:t>
+            </w:r>
+            <w:r>
+              <w:rPr>
+                <w:b w:val="0"/>
+                <w:bCs/>
+              </w:rPr>
+              <w:t xml:space="preserve"> Game Lore label/title to </w:t>
+            </w:r>
+            <w:r>
+              <w:rPr>
+                <w:b w:val="0"/>
+                <w:bCs/>
+              </w:rPr>
+              <w:t>C</w:t>
+            </w:r>
+            <w:r>
+              <w:rPr>
+                <w:b w:val="0"/>
+                <w:bCs/>
+              </w:rPr>
+              <w:t xml:space="preserve">haracter </w:t>
+            </w:r>
+            <w:r>
+              <w:rPr>
+                <w:b w:val="0"/>
+                <w:bCs/>
+              </w:rPr>
+              <w:t>I</w:t>
+            </w:r>
+            <w:r>
+              <w:rPr>
+                <w:b w:val="0"/>
+                <w:bCs/>
+              </w:rPr>
+              <w:t xml:space="preserve">nformation or </w:t>
+            </w:r>
+            <w:r>
+              <w:rPr>
+                <w:b w:val="0"/>
+                <w:bCs/>
+              </w:rPr>
+              <w:t>G</w:t>
+            </w:r>
+            <w:r>
+              <w:rPr>
+                <w:b w:val="0"/>
+                <w:bCs/>
+              </w:rPr>
+              <w:t xml:space="preserve">ame </w:t>
+            </w:r>
+            <w:r>
+              <w:rPr>
+                <w:b w:val="0"/>
+                <w:bCs/>
+              </w:rPr>
+              <w:t>B</w:t>
+            </w:r>
+            <w:r>
+              <w:rPr>
+                <w:b w:val="0"/>
+                <w:bCs/>
+              </w:rPr>
+              <w:t>ackgrounds</w:t>
+            </w:r>
+          </w:p>
+          <w:p>
+            <w:pPr>
+              <w:pStyle w:val="ListParagraph"/>
+              <w:numPr>
+                <w:ilvl w:val="0"/>
+                <w:numId w:val="12"/>
+              </w:numPr>
+              <w:rPr>
+                <w:b w:val="0"/>
+                <w:bCs/>
+              </w:rPr>
+            </w:pPr>
+            <w:r>
+              <w:rPr>
+                <w:b w:val="0"/>
+                <w:bCs/>
+              </w:rPr>
+              <w:t>Add specs to the Hardware Reviews label/title</w:t>
+            </w:r>
+          </w:p>
+          <w:p>
+            <w:pPr>
+              <w:pStyle w:val="ListParagraph"/>
+              <w:numPr>
+                <w:ilvl w:val="0"/>
+                <w:numId w:val="12"/>
+              </w:numPr>
+              <w:rPr>
+                <w:b w:val="0"/>
+                <w:bCs/>
+              </w:rPr>
+            </w:pPr>
+            <w:r>
+              <w:rPr>
+                <w:b w:val="0"/>
+                <w:bCs/>
+              </w:rPr>
+              <w:t xml:space="preserve">Merge Walkthroughs and Guides </w:t>
+            </w:r>
+            <w:r>
+              <w:rPr>
+                <w:b w:val="0"/>
+                <w:bCs/>
+              </w:rPr>
+              <w:t>into one label/title</w:t>
+            </w:r>
+          </w:p>
+          <w:p>
+            <w:pPr>
+              <w:pStyle w:val="ListParagraph"/>
+              <w:numPr>
+                <w:ilvl w:val="0"/>
+                <w:numId w:val="12"/>
+              </w:numPr>
+              <w:rPr>
+                <w:b w:val="0"/>
+                <w:bCs/>
+              </w:rPr>
+            </w:pPr>
+            <w:r>
+              <w:rPr>
+                <w:b w:val="0"/>
+                <w:bCs/>
+              </w:rPr>
+              <w:t>Make some modifications to make pages more user friendly</w:t>
             </w:r>
           </w:p>
           <w:p>
@@ -3060,7 +3505,14 @@
           </w:tcPr>
           <w:p>
             <w:pPr>
-              <w:ind w:left="115"/>
+              <w:pStyle w:val="ListParagraph"/>
+              <w:numPr>
+                <w:ilvl w:val="0"/>
+                <w:numId w:val="4"/>
+              </w:numPr>
+              <w:rPr>
+                <w:rFonts w:ascii="Calibri" w:hAnsi="Calibri" w:cs="Calibri"/>
+              </w:rPr>
             </w:pPr>
             <w:r>
               <w:rPr>
@@ -3070,13 +3522,555 @@
                 <w:color w:val="1D2125"/>
                 <w:sz w:val="24"/>
               </w:rPr>
-              <w:t xml:space="preserve">List the labels </w:t>
-            </w:r>
-            <w:r>
-              <w:rPr>
-                <w:b w:val="0"/>
-              </w:rPr>
-              <w:t xml:space="preserve"> </w:t>
+              <w:lastRenderedPageBreak/>
+              <w:t>Homes</w:t>
+            </w:r>
+          </w:p>
+          <w:p>
+            <w:pPr>
+              <w:pStyle w:val="ListParagraph"/>
+              <w:numPr>
+                <w:ilvl w:val="1"/>
+                <w:numId w:val="4"/>
+              </w:numPr>
+              <w:rPr>
+                <w:rFonts w:ascii="Calibri" w:hAnsi="Calibri" w:cs="Calibri"/>
+                <w:b w:val="0"/>
+                <w:bCs/>
+              </w:rPr>
+            </w:pPr>
+            <w:r>
+              <w:rPr>
+                <w:rFonts w:ascii="Calibri" w:hAnsi="Calibri" w:cs="Calibri"/>
+                <w:b w:val="0"/>
+                <w:bCs/>
+              </w:rPr>
+              <w:t>Walkthroughs</w:t>
+            </w:r>
+          </w:p>
+          <w:p>
+            <w:pPr>
+              <w:pStyle w:val="ListParagraph"/>
+              <w:numPr>
+                <w:ilvl w:val="2"/>
+                <w:numId w:val="4"/>
+              </w:numPr>
+              <w:rPr>
+                <w:rFonts w:ascii="Calibri" w:hAnsi="Calibri" w:cs="Calibri"/>
+                <w:b w:val="0"/>
+                <w:bCs/>
+              </w:rPr>
+            </w:pPr>
+            <w:r>
+              <w:rPr>
+                <w:rFonts w:ascii="Calibri" w:hAnsi="Calibri" w:cs="Calibri"/>
+                <w:b w:val="0"/>
+                <w:bCs/>
+              </w:rPr>
+              <w:t>Easter eggs/hidden content</w:t>
+            </w:r>
+          </w:p>
+          <w:p>
+            <w:pPr>
+              <w:pStyle w:val="ListParagraph"/>
+              <w:numPr>
+                <w:ilvl w:val="3"/>
+                <w:numId w:val="4"/>
+              </w:numPr>
+              <w:rPr>
+                <w:rFonts w:ascii="Calibri" w:hAnsi="Calibri" w:cs="Calibri"/>
+                <w:b w:val="0"/>
+                <w:bCs/>
+              </w:rPr>
+            </w:pPr>
+            <w:r>
+              <w:rPr>
+                <w:rFonts w:ascii="Calibri" w:hAnsi="Calibri" w:cs="Calibri"/>
+                <w:b w:val="0"/>
+                <w:bCs/>
+              </w:rPr>
+              <w:t>Game Lore</w:t>
+            </w:r>
+          </w:p>
+          <w:p>
+            <w:pPr>
+              <w:pStyle w:val="ListParagraph"/>
+              <w:numPr>
+                <w:ilvl w:val="2"/>
+                <w:numId w:val="4"/>
+              </w:numPr>
+              <w:rPr>
+                <w:rFonts w:ascii="Calibri" w:hAnsi="Calibri" w:cs="Calibri"/>
+                <w:b w:val="0"/>
+                <w:bCs/>
+              </w:rPr>
+            </w:pPr>
+            <w:r>
+              <w:rPr>
+                <w:rFonts w:ascii="Calibri" w:hAnsi="Calibri" w:cs="Calibri"/>
+                <w:b w:val="0"/>
+                <w:bCs/>
+              </w:rPr>
+              <w:t>Guides</w:t>
+            </w:r>
+          </w:p>
+          <w:p>
+            <w:pPr>
+              <w:pStyle w:val="ListParagraph"/>
+              <w:numPr>
+                <w:ilvl w:val="3"/>
+                <w:numId w:val="4"/>
+              </w:numPr>
+              <w:rPr>
+                <w:rFonts w:ascii="Calibri" w:hAnsi="Calibri" w:cs="Calibri"/>
+                <w:b w:val="0"/>
+                <w:bCs/>
+              </w:rPr>
+            </w:pPr>
+            <w:r>
+              <w:rPr>
+                <w:rFonts w:ascii="Calibri" w:hAnsi="Calibri" w:cs="Calibri"/>
+                <w:b w:val="0"/>
+                <w:bCs/>
+              </w:rPr>
+              <w:t>Gameplay Walkthroughs</w:t>
+            </w:r>
+          </w:p>
+          <w:p>
+            <w:pPr>
+              <w:pStyle w:val="ListParagraph"/>
+              <w:numPr>
+                <w:ilvl w:val="3"/>
+                <w:numId w:val="4"/>
+              </w:numPr>
+              <w:rPr>
+                <w:rFonts w:ascii="Calibri" w:hAnsi="Calibri" w:cs="Calibri"/>
+                <w:b w:val="0"/>
+                <w:bCs/>
+              </w:rPr>
+            </w:pPr>
+            <w:r>
+              <w:rPr>
+                <w:rFonts w:ascii="Calibri" w:hAnsi="Calibri" w:cs="Calibri"/>
+                <w:b w:val="0"/>
+                <w:bCs/>
+              </w:rPr>
+              <w:t>Achievement/Accolade Guides</w:t>
+            </w:r>
+          </w:p>
+          <w:p>
+            <w:pPr>
+              <w:pStyle w:val="ListParagraph"/>
+              <w:numPr>
+                <w:ilvl w:val="1"/>
+                <w:numId w:val="4"/>
+              </w:numPr>
+              <w:rPr>
+                <w:rFonts w:ascii="Calibri" w:hAnsi="Calibri" w:cs="Calibri"/>
+                <w:b w:val="0"/>
+                <w:bCs/>
+              </w:rPr>
+            </w:pPr>
+            <w:r>
+              <w:rPr>
+                <w:rFonts w:ascii="Calibri" w:hAnsi="Calibri" w:cs="Calibri"/>
+                <w:b w:val="0"/>
+                <w:bCs/>
+              </w:rPr>
+              <w:t>Reviews</w:t>
+            </w:r>
+          </w:p>
+          <w:p>
+            <w:pPr>
+              <w:pStyle w:val="ListParagraph"/>
+              <w:numPr>
+                <w:ilvl w:val="2"/>
+                <w:numId w:val="4"/>
+              </w:numPr>
+              <w:rPr>
+                <w:rFonts w:ascii="Calibri" w:hAnsi="Calibri" w:cs="Calibri"/>
+                <w:b w:val="0"/>
+                <w:bCs/>
+              </w:rPr>
+            </w:pPr>
+            <w:r>
+              <w:rPr>
+                <w:rFonts w:ascii="Calibri" w:hAnsi="Calibri" w:cs="Calibri"/>
+                <w:b w:val="0"/>
+                <w:bCs/>
+              </w:rPr>
+              <w:t>Game Reviews</w:t>
+            </w:r>
+          </w:p>
+          <w:p>
+            <w:pPr>
+              <w:pStyle w:val="ListParagraph"/>
+              <w:numPr>
+                <w:ilvl w:val="2"/>
+                <w:numId w:val="4"/>
+              </w:numPr>
+              <w:rPr>
+                <w:rFonts w:ascii="Calibri" w:hAnsi="Calibri" w:cs="Calibri"/>
+                <w:b w:val="0"/>
+                <w:bCs/>
+              </w:rPr>
+            </w:pPr>
+            <w:r>
+              <w:rPr>
+                <w:rFonts w:ascii="Calibri" w:hAnsi="Calibri" w:cs="Calibri"/>
+                <w:b w:val="0"/>
+                <w:bCs/>
+              </w:rPr>
+              <w:t>Hardware Reviews</w:t>
+            </w:r>
+          </w:p>
+          <w:p>
+            <w:pPr>
+              <w:pStyle w:val="ListParagraph"/>
+              <w:numPr>
+                <w:ilvl w:val="0"/>
+                <w:numId w:val="4"/>
+              </w:numPr>
+              <w:rPr>
+                <w:rFonts w:ascii="Calibri" w:hAnsi="Calibri" w:cs="Calibri"/>
+                <w:b w:val="0"/>
+                <w:bCs/>
+              </w:rPr>
+            </w:pPr>
+            <w:r>
+              <w:rPr>
+                <w:rFonts w:ascii="Calibri" w:hAnsi="Calibri" w:cs="Calibri"/>
+                <w:b w:val="0"/>
+                <w:bCs/>
+              </w:rPr>
+              <w:t>Discussions</w:t>
+            </w:r>
+          </w:p>
+          <w:p>
+            <w:pPr>
+              <w:pStyle w:val="ListParagraph"/>
+              <w:numPr>
+                <w:ilvl w:val="1"/>
+                <w:numId w:val="4"/>
+              </w:numPr>
+              <w:rPr>
+                <w:rFonts w:ascii="Calibri" w:hAnsi="Calibri" w:cs="Calibri"/>
+                <w:b w:val="0"/>
+                <w:bCs/>
+              </w:rPr>
+            </w:pPr>
+            <w:r>
+              <w:rPr>
+                <w:rFonts w:ascii="Calibri" w:hAnsi="Calibri" w:cs="Calibri"/>
+                <w:b w:val="0"/>
+                <w:bCs/>
+              </w:rPr>
+              <w:t>Discussion Post</w:t>
+            </w:r>
+          </w:p>
+          <w:p>
+            <w:pPr>
+              <w:pStyle w:val="ListParagraph"/>
+              <w:numPr>
+                <w:ilvl w:val="2"/>
+                <w:numId w:val="4"/>
+              </w:numPr>
+              <w:rPr>
+                <w:rFonts w:ascii="Calibri" w:hAnsi="Calibri" w:cs="Calibri"/>
+                <w:b w:val="0"/>
+                <w:bCs/>
+              </w:rPr>
+            </w:pPr>
+            <w:r>
+              <w:rPr>
+                <w:rFonts w:ascii="Calibri" w:hAnsi="Calibri" w:cs="Calibri"/>
+                <w:b w:val="0"/>
+                <w:bCs/>
+              </w:rPr>
+              <w:t>YAG Discord</w:t>
+            </w:r>
+          </w:p>
+          <w:p>
+            <w:pPr>
+              <w:pStyle w:val="ListParagraph"/>
+              <w:numPr>
+                <w:ilvl w:val="0"/>
+                <w:numId w:val="4"/>
+              </w:numPr>
+              <w:rPr>
+                <w:rFonts w:ascii="Calibri" w:hAnsi="Calibri" w:cs="Calibri"/>
+                <w:b w:val="0"/>
+                <w:bCs/>
+              </w:rPr>
+            </w:pPr>
+            <w:r>
+              <w:rPr>
+                <w:rFonts w:ascii="Calibri" w:hAnsi="Calibri" w:cs="Calibri"/>
+                <w:b w:val="0"/>
+                <w:bCs/>
+              </w:rPr>
+              <w:t>Multimedia</w:t>
+            </w:r>
+          </w:p>
+          <w:p>
+            <w:pPr>
+              <w:pStyle w:val="ListParagraph"/>
+              <w:numPr>
+                <w:ilvl w:val="1"/>
+                <w:numId w:val="4"/>
+              </w:numPr>
+              <w:rPr>
+                <w:rFonts w:ascii="Calibri" w:hAnsi="Calibri" w:cs="Calibri"/>
+                <w:b w:val="0"/>
+                <w:bCs/>
+              </w:rPr>
+            </w:pPr>
+            <w:r>
+              <w:rPr>
+                <w:rFonts w:ascii="Calibri" w:hAnsi="Calibri" w:cs="Calibri"/>
+                <w:b w:val="0"/>
+                <w:bCs/>
+              </w:rPr>
+              <w:t>GIFS/Pictures</w:t>
+            </w:r>
+          </w:p>
+          <w:p>
+            <w:pPr>
+              <w:pStyle w:val="ListParagraph"/>
+              <w:numPr>
+                <w:ilvl w:val="1"/>
+                <w:numId w:val="4"/>
+              </w:numPr>
+              <w:rPr>
+                <w:rFonts w:ascii="Calibri" w:hAnsi="Calibri" w:cs="Calibri"/>
+                <w:b w:val="0"/>
+                <w:bCs/>
+              </w:rPr>
+            </w:pPr>
+            <w:r>
+              <w:rPr>
+                <w:rFonts w:ascii="Calibri" w:hAnsi="Calibri" w:cs="Calibri"/>
+                <w:b w:val="0"/>
+                <w:bCs/>
+              </w:rPr>
+              <w:t>Game Trailers</w:t>
+            </w:r>
+          </w:p>
+          <w:p>
+            <w:pPr>
+              <w:pStyle w:val="ListParagraph"/>
+              <w:numPr>
+                <w:ilvl w:val="1"/>
+                <w:numId w:val="4"/>
+              </w:numPr>
+              <w:rPr>
+                <w:rFonts w:ascii="Calibri" w:hAnsi="Calibri" w:cs="Calibri"/>
+                <w:b w:val="0"/>
+                <w:bCs/>
+              </w:rPr>
+            </w:pPr>
+            <w:r>
+              <w:rPr>
+                <w:rFonts w:ascii="Calibri" w:hAnsi="Calibri" w:cs="Calibri"/>
+                <w:b w:val="0"/>
+                <w:bCs/>
+              </w:rPr>
+              <w:t>Gameplay Breakdown</w:t>
+            </w:r>
+          </w:p>
+          <w:p>
+            <w:pPr>
+              <w:pStyle w:val="ListParagraph"/>
+              <w:numPr>
+                <w:ilvl w:val="0"/>
+                <w:numId w:val="4"/>
+              </w:numPr>
+            </w:pPr>
+            <w:r>
+              <w:rPr>
+                <w:rFonts w:ascii="Calibri" w:hAnsi="Calibri" w:cs="Calibri"/>
+                <w:b w:val="0"/>
+                <w:bCs/>
+              </w:rPr>
+              <w:t>News</w:t>
+            </w:r>
+          </w:p>
+          <w:p>
+            <w:pPr>
+              <w:pStyle w:val="ListParagraph"/>
+              <w:numPr>
+                <w:ilvl w:val="1"/>
+                <w:numId w:val="4"/>
+              </w:numPr>
+            </w:pPr>
+            <w:r>
+              <w:rPr>
+                <w:rFonts w:ascii="Calibri" w:hAnsi="Calibri" w:cs="Calibri"/>
+                <w:b w:val="0"/>
+                <w:bCs/>
+              </w:rPr>
+              <w:t>Content Creator Updates</w:t>
+            </w:r>
+          </w:p>
+          <w:p>
+            <w:pPr>
+              <w:pStyle w:val="ListParagraph"/>
+              <w:numPr>
+                <w:ilvl w:val="1"/>
+                <w:numId w:val="4"/>
+              </w:numPr>
+            </w:pPr>
+            <w:r>
+              <w:rPr>
+                <w:rFonts w:ascii="Calibri" w:hAnsi="Calibri" w:cs="Calibri"/>
+                <w:b w:val="0"/>
+                <w:bCs/>
+              </w:rPr>
+              <w:t>Game Releases</w:t>
+            </w:r>
+          </w:p>
+          <w:p>
+            <w:pPr>
+              <w:pStyle w:val="ListParagraph"/>
+              <w:numPr>
+                <w:ilvl w:val="1"/>
+                <w:numId w:val="4"/>
+              </w:numPr>
+              <w:rPr>
+                <w:rFonts w:ascii="Calibri" w:hAnsi="Calibri" w:cs="Calibri"/>
+                <w:b w:val="0"/>
+                <w:bCs/>
+              </w:rPr>
+            </w:pPr>
+            <w:r>
+              <w:rPr>
+                <w:rFonts w:ascii="Calibri" w:hAnsi="Calibri" w:cs="Calibri"/>
+                <w:b w:val="0"/>
+                <w:bCs/>
+              </w:rPr>
+              <w:t>Platforms</w:t>
+            </w:r>
+          </w:p>
+          <w:p>
+            <w:pPr>
+              <w:pStyle w:val="ListParagraph"/>
+              <w:numPr>
+                <w:ilvl w:val="2"/>
+                <w:numId w:val="4"/>
+              </w:numPr>
+            </w:pPr>
+            <w:r>
+              <w:rPr>
+                <w:rFonts w:ascii="Calibri" w:hAnsi="Calibri" w:cs="Calibri"/>
+                <w:b w:val="0"/>
+                <w:bCs/>
+              </w:rPr>
+              <w:t>PC</w:t>
+            </w:r>
+          </w:p>
+          <w:p>
+            <w:pPr>
+              <w:pStyle w:val="ListParagraph"/>
+              <w:numPr>
+                <w:ilvl w:val="2"/>
+                <w:numId w:val="4"/>
+              </w:numPr>
+              <w:rPr>
+                <w:rFonts w:ascii="Calibri" w:hAnsi="Calibri" w:cs="Calibri"/>
+                <w:b w:val="0"/>
+                <w:bCs/>
+              </w:rPr>
+            </w:pPr>
+            <w:r>
+              <w:rPr>
+                <w:rFonts w:ascii="Calibri" w:hAnsi="Calibri" w:cs="Calibri"/>
+                <w:b w:val="0"/>
+                <w:bCs/>
+              </w:rPr>
+              <w:t>PlayStation</w:t>
+            </w:r>
+          </w:p>
+          <w:p>
+            <w:pPr>
+              <w:pStyle w:val="ListParagraph"/>
+              <w:numPr>
+                <w:ilvl w:val="2"/>
+                <w:numId w:val="4"/>
+              </w:numPr>
+              <w:rPr>
+                <w:rFonts w:ascii="Calibri" w:hAnsi="Calibri" w:cs="Calibri"/>
+                <w:b w:val="0"/>
+                <w:bCs/>
+              </w:rPr>
+            </w:pPr>
+            <w:r>
+              <w:rPr>
+                <w:rFonts w:ascii="Calibri" w:hAnsi="Calibri" w:cs="Calibri"/>
+                <w:b w:val="0"/>
+                <w:bCs/>
+              </w:rPr>
+              <w:t>Xbox</w:t>
+            </w:r>
+          </w:p>
+          <w:p>
+            <w:pPr>
+              <w:pStyle w:val="ListParagraph"/>
+              <w:numPr>
+                <w:ilvl w:val="2"/>
+                <w:numId w:val="4"/>
+              </w:numPr>
+              <w:rPr>
+                <w:rFonts w:ascii="Calibri" w:hAnsi="Calibri" w:cs="Calibri"/>
+                <w:b w:val="0"/>
+                <w:bCs/>
+              </w:rPr>
+            </w:pPr>
+            <w:r>
+              <w:rPr>
+                <w:rFonts w:ascii="Calibri" w:hAnsi="Calibri" w:cs="Calibri"/>
+                <w:b w:val="0"/>
+                <w:bCs/>
+              </w:rPr>
+              <w:t>Nintendo</w:t>
+            </w:r>
+          </w:p>
+          <w:p>
+            <w:pPr>
+              <w:pStyle w:val="ListParagraph"/>
+              <w:numPr>
+                <w:ilvl w:val="2"/>
+                <w:numId w:val="4"/>
+              </w:numPr>
+              <w:rPr>
+                <w:rFonts w:ascii="Calibri" w:hAnsi="Calibri" w:cs="Calibri"/>
+                <w:b w:val="0"/>
+                <w:bCs/>
+              </w:rPr>
+            </w:pPr>
+            <w:r>
+              <w:rPr>
+                <w:rFonts w:ascii="Calibri" w:hAnsi="Calibri" w:cs="Calibri"/>
+                <w:b w:val="0"/>
+                <w:bCs/>
+              </w:rPr>
+              <w:t>Mobile</w:t>
+            </w:r>
+          </w:p>
+          <w:p>
+            <w:pPr>
+              <w:pStyle w:val="ListParagraph"/>
+              <w:numPr>
+                <w:ilvl w:val="2"/>
+                <w:numId w:val="4"/>
+              </w:numPr>
+            </w:pPr>
+            <w:r>
+              <w:rPr>
+                <w:rFonts w:ascii="Calibri" w:hAnsi="Calibri" w:cs="Calibri"/>
+                <w:b w:val="0"/>
+                <w:bCs/>
+              </w:rPr>
+              <w:t>VR/AR</w:t>
             </w:r>
           </w:p>
         </w:tc>
@@ -3494,7 +4488,7 @@
   <w:abstractNum w:abstractNumId="3" w15:restartNumberingAfterBreak="0">
     <w:nsid w:val="4017652C"/>
     <w:multiLevelType w:val="hybridMultilevel"/>
-    <w:tmpl w:val="D7D0D57A"/>
+    <w:tmpl w:val="978A15BC"/>
     <w:lvl w:ilvl="0" w:tplc="04090001">
       <w:start w:val="1"/>
       <w:numFmt w:val="bullet"/>
@@ -3507,7 +4501,7 @@
         <w:rFonts w:ascii="Symbol" w:hAnsi="Symbol" w:hint="default"/>
       </w:rPr>
     </w:lvl>
-    <w:lvl w:ilvl="1" w:tplc="04090003" w:tentative="1">
+    <w:lvl w:ilvl="1" w:tplc="04090003">
       <w:start w:val="1"/>
       <w:numFmt w:val="bullet"/>
       <w:lvlText w:val="o"/>
@@ -3519,7 +4513,7 @@
         <w:rFonts w:ascii="Courier New" w:hAnsi="Courier New" w:cs="Courier New" w:hint="default"/>
       </w:rPr>
     </w:lvl>
-    <w:lvl w:ilvl="2" w:tplc="04090005" w:tentative="1">
+    <w:lvl w:ilvl="2" w:tplc="04090005">
       <w:start w:val="1"/>
       <w:numFmt w:val="bullet"/>
       <w:lvlText w:val=""/>
@@ -3531,7 +4525,7 @@
         <w:rFonts w:ascii="Wingdings" w:hAnsi="Wingdings" w:hint="default"/>
       </w:rPr>
     </w:lvl>
-    <w:lvl w:ilvl="3" w:tplc="04090001" w:tentative="1">
+    <w:lvl w:ilvl="3" w:tplc="04090001">
       <w:start w:val="1"/>
       <w:numFmt w:val="bullet"/>
       <w:lvlText w:val=""/>
@@ -3605,6 +4599,95 @@
     </w:lvl>
   </w:abstractNum>
   <w:abstractNum w:abstractNumId="4" w15:restartNumberingAfterBreak="0">
+    <w:nsid w:val="45F0590E"/>
+    <w:multiLevelType w:val="hybridMultilevel"/>
+    <w:tmpl w:val="256AC84A"/>
+    <w:lvl w:ilvl="0" w:tplc="FFFFFFFF">
+      <w:start w:val="1"/>
+      <w:numFmt w:val="decimal"/>
+      <w:lvlText w:val="%1."/>
+      <w:lvlJc w:val="left"/>
+      <w:pPr>
+        <w:ind w:left="835" w:hanging="360"/>
+      </w:pPr>
+      <w:rPr>
+        <w:rFonts w:hint="default"/>
+      </w:rPr>
+    </w:lvl>
+    <w:lvl w:ilvl="1" w:tplc="FFFFFFFF" w:tentative="1">
+      <w:start w:val="1"/>
+      <w:numFmt w:val="lowerLetter"/>
+      <w:lvlText w:val="%2."/>
+      <w:lvlJc w:val="left"/>
+      <w:pPr>
+        <w:ind w:left="1555" w:hanging="360"/>
+      </w:pPr>
+    </w:lvl>
+    <w:lvl w:ilvl="2" w:tplc="FFFFFFFF" w:tentative="1">
+      <w:start w:val="1"/>
+      <w:numFmt w:val="lowerRoman"/>
+      <w:lvlText w:val="%3."/>
+      <w:lvlJc w:val="right"/>
+      <w:pPr>
+        <w:ind w:left="2275" w:hanging="180"/>
+      </w:pPr>
+    </w:lvl>
+    <w:lvl w:ilvl="3" w:tplc="FFFFFFFF" w:tentative="1">
+      <w:start w:val="1"/>
+      <w:numFmt w:val="decimal"/>
+      <w:lvlText w:val="%4."/>
+      <w:lvlJc w:val="left"/>
+      <w:pPr>
+        <w:ind w:left="2995" w:hanging="360"/>
+      </w:pPr>
+    </w:lvl>
+    <w:lvl w:ilvl="4" w:tplc="FFFFFFFF" w:tentative="1">
+      <w:start w:val="1"/>
+      <w:numFmt w:val="lowerLetter"/>
+      <w:lvlText w:val="%5."/>
+      <w:lvlJc w:val="left"/>
+      <w:pPr>
+        <w:ind w:left="3715" w:hanging="360"/>
+      </w:pPr>
+    </w:lvl>
+    <w:lvl w:ilvl="5" w:tplc="FFFFFFFF" w:tentative="1">
+      <w:start w:val="1"/>
+      <w:numFmt w:val="lowerRoman"/>
+      <w:lvlText w:val="%6."/>
+      <w:lvlJc w:val="right"/>
+      <w:pPr>
+        <w:ind w:left="4435" w:hanging="180"/>
+      </w:pPr>
+    </w:lvl>
+    <w:lvl w:ilvl="6" w:tplc="FFFFFFFF" w:tentative="1">
+      <w:start w:val="1"/>
+      <w:numFmt w:val="decimal"/>
+      <w:lvlText w:val="%7."/>
+      <w:lvlJc w:val="left"/>
+      <w:pPr>
+        <w:ind w:left="5155" w:hanging="360"/>
+      </w:pPr>
+    </w:lvl>
+    <w:lvl w:ilvl="7" w:tplc="FFFFFFFF" w:tentative="1">
+      <w:start w:val="1"/>
+      <w:numFmt w:val="lowerLetter"/>
+      <w:lvlText w:val="%8."/>
+      <w:lvlJc w:val="left"/>
+      <w:pPr>
+        <w:ind w:left="5875" w:hanging="360"/>
+      </w:pPr>
+    </w:lvl>
+    <w:lvl w:ilvl="8" w:tplc="FFFFFFFF" w:tentative="1">
+      <w:start w:val="1"/>
+      <w:numFmt w:val="lowerRoman"/>
+      <w:lvlText w:val="%9."/>
+      <w:lvlJc w:val="right"/>
+      <w:pPr>
+        <w:ind w:left="6595" w:hanging="180"/>
+      </w:pPr>
+    </w:lvl>
+  </w:abstractNum>
+  <w:abstractNum w:abstractNumId="5" w15:restartNumberingAfterBreak="0">
     <w:nsid w:val="54FB5E14"/>
     <w:multiLevelType w:val="hybridMultilevel"/>
     <w:tmpl w:val="CA50099E"/>
@@ -3718,7 +4801,120 @@
       </w:rPr>
     </w:lvl>
   </w:abstractNum>
-  <w:abstractNum w:abstractNumId="5" w15:restartNumberingAfterBreak="0">
+  <w:abstractNum w:abstractNumId="6" w15:restartNumberingAfterBreak="0">
+    <w:nsid w:val="557B11F2"/>
+    <w:multiLevelType w:val="hybridMultilevel"/>
+    <w:tmpl w:val="6F3E289A"/>
+    <w:lvl w:ilvl="0" w:tplc="04090001">
+      <w:start w:val="1"/>
+      <w:numFmt w:val="bullet"/>
+      <w:lvlText w:val=""/>
+      <w:lvlJc w:val="left"/>
+      <w:pPr>
+        <w:ind w:left="835" w:hanging="360"/>
+      </w:pPr>
+      <w:rPr>
+        <w:rFonts w:ascii="Symbol" w:hAnsi="Symbol" w:hint="default"/>
+      </w:rPr>
+    </w:lvl>
+    <w:lvl w:ilvl="1" w:tplc="04090003" w:tentative="1">
+      <w:start w:val="1"/>
+      <w:numFmt w:val="bullet"/>
+      <w:lvlText w:val="o"/>
+      <w:lvlJc w:val="left"/>
+      <w:pPr>
+        <w:ind w:left="1555" w:hanging="360"/>
+      </w:pPr>
+      <w:rPr>
+        <w:rFonts w:ascii="Courier New" w:hAnsi="Courier New" w:cs="Courier New" w:hint="default"/>
+      </w:rPr>
+    </w:lvl>
+    <w:lvl w:ilvl="2" w:tplc="04090005" w:tentative="1">
+      <w:start w:val="1"/>
+      <w:numFmt w:val="bullet"/>
+      <w:lvlText w:val=""/>
+      <w:lvlJc w:val="left"/>
+      <w:pPr>
+        <w:ind w:left="2275" w:hanging="360"/>
+      </w:pPr>
+      <w:rPr>
+        <w:rFonts w:ascii="Wingdings" w:hAnsi="Wingdings" w:hint="default"/>
+      </w:rPr>
+    </w:lvl>
+    <w:lvl w:ilvl="3" w:tplc="04090001" w:tentative="1">
+      <w:start w:val="1"/>
+      <w:numFmt w:val="bullet"/>
+      <w:lvlText w:val=""/>
+      <w:lvlJc w:val="left"/>
+      <w:pPr>
+        <w:ind w:left="2995" w:hanging="360"/>
+      </w:pPr>
+      <w:rPr>
+        <w:rFonts w:ascii="Symbol" w:hAnsi="Symbol" w:hint="default"/>
+      </w:rPr>
+    </w:lvl>
+    <w:lvl w:ilvl="4" w:tplc="04090003" w:tentative="1">
+      <w:start w:val="1"/>
+      <w:numFmt w:val="bullet"/>
+      <w:lvlText w:val="o"/>
+      <w:lvlJc w:val="left"/>
+      <w:pPr>
+        <w:ind w:left="3715" w:hanging="360"/>
+      </w:pPr>
+      <w:rPr>
+        <w:rFonts w:ascii="Courier New" w:hAnsi="Courier New" w:cs="Courier New" w:hint="default"/>
+      </w:rPr>
+    </w:lvl>
+    <w:lvl w:ilvl="5" w:tplc="04090005" w:tentative="1">
+      <w:start w:val="1"/>
+      <w:numFmt w:val="bullet"/>
+      <w:lvlText w:val=""/>
+      <w:lvlJc w:val="left"/>
+      <w:pPr>
+        <w:ind w:left="4435" w:hanging="360"/>
+      </w:pPr>
+      <w:rPr>
+        <w:rFonts w:ascii="Wingdings" w:hAnsi="Wingdings" w:hint="default"/>
+      </w:rPr>
+    </w:lvl>
+    <w:lvl w:ilvl="6" w:tplc="04090001" w:tentative="1">
+      <w:start w:val="1"/>
+      <w:numFmt w:val="bullet"/>
+      <w:lvlText w:val=""/>
+      <w:lvlJc w:val="left"/>
+      <w:pPr>
+        <w:ind w:left="5155" w:hanging="360"/>
+      </w:pPr>
+      <w:rPr>
+        <w:rFonts w:ascii="Symbol" w:hAnsi="Symbol" w:hint="default"/>
+      </w:rPr>
+    </w:lvl>
+    <w:lvl w:ilvl="7" w:tplc="04090003" w:tentative="1">
+      <w:start w:val="1"/>
+      <w:numFmt w:val="bullet"/>
+      <w:lvlText w:val="o"/>
+      <w:lvlJc w:val="left"/>
+      <w:pPr>
+        <w:ind w:left="5875" w:hanging="360"/>
+      </w:pPr>
+      <w:rPr>
+        <w:rFonts w:ascii="Courier New" w:hAnsi="Courier New" w:cs="Courier New" w:hint="default"/>
+      </w:rPr>
+    </w:lvl>
+    <w:lvl w:ilvl="8" w:tplc="04090005" w:tentative="1">
+      <w:start w:val="1"/>
+      <w:numFmt w:val="bullet"/>
+      <w:lvlText w:val=""/>
+      <w:lvlJc w:val="left"/>
+      <w:pPr>
+        <w:ind w:left="6595" w:hanging="360"/>
+      </w:pPr>
+      <w:rPr>
+        <w:rFonts w:ascii="Wingdings" w:hAnsi="Wingdings" w:hint="default"/>
+      </w:rPr>
+    </w:lvl>
+  </w:abstractNum>
+  <w:abstractNum w:abstractNumId="7" w15:restartNumberingAfterBreak="0">
     <w:nsid w:val="58615448"/>
     <w:multiLevelType w:val="hybridMultilevel"/>
     <w:tmpl w:val="1C2E97CC"/>
@@ -3811,7 +5007,7 @@
       </w:pPr>
     </w:lvl>
   </w:abstractNum>
-  <w:abstractNum w:abstractNumId="6" w15:restartNumberingAfterBreak="0">
+  <w:abstractNum w:abstractNumId="8" w15:restartNumberingAfterBreak="0">
     <w:nsid w:val="5FB3162D"/>
     <w:multiLevelType w:val="hybridMultilevel"/>
     <w:tmpl w:val="EAB22CA4"/>
@@ -3900,10 +5096,10 @@
       </w:pPr>
     </w:lvl>
   </w:abstractNum>
-  <w:abstractNum w:abstractNumId="7" w15:restartNumberingAfterBreak="0">
+  <w:abstractNum w:abstractNumId="9" w15:restartNumberingAfterBreak="0">
     <w:nsid w:val="681D6838"/>
     <w:multiLevelType w:val="hybridMultilevel"/>
-    <w:tmpl w:val="1FE28508"/>
+    <w:tmpl w:val="256AC84A"/>
     <w:lvl w:ilvl="0" w:tplc="0409000F">
       <w:start w:val="1"/>
       <w:numFmt w:val="decimal"/>
@@ -3989,7 +5185,120 @@
       </w:pPr>
     </w:lvl>
   </w:abstractNum>
-  <w:abstractNum w:abstractNumId="8" w15:restartNumberingAfterBreak="0">
+  <w:abstractNum w:abstractNumId="10" w15:restartNumberingAfterBreak="0">
+    <w:nsid w:val="6FE3196B"/>
+    <w:multiLevelType w:val="hybridMultilevel"/>
+    <w:tmpl w:val="4D38CC7A"/>
+    <w:lvl w:ilvl="0" w:tplc="04090001">
+      <w:start w:val="1"/>
+      <w:numFmt w:val="bullet"/>
+      <w:lvlText w:val=""/>
+      <w:lvlJc w:val="left"/>
+      <w:pPr>
+        <w:ind w:left="835" w:hanging="360"/>
+      </w:pPr>
+      <w:rPr>
+        <w:rFonts w:ascii="Symbol" w:hAnsi="Symbol" w:hint="default"/>
+      </w:rPr>
+    </w:lvl>
+    <w:lvl w:ilvl="1" w:tplc="04090003" w:tentative="1">
+      <w:start w:val="1"/>
+      <w:numFmt w:val="bullet"/>
+      <w:lvlText w:val="o"/>
+      <w:lvlJc w:val="left"/>
+      <w:pPr>
+        <w:ind w:left="1555" w:hanging="360"/>
+      </w:pPr>
+      <w:rPr>
+        <w:rFonts w:ascii="Courier New" w:hAnsi="Courier New" w:cs="Courier New" w:hint="default"/>
+      </w:rPr>
+    </w:lvl>
+    <w:lvl w:ilvl="2" w:tplc="04090005" w:tentative="1">
+      <w:start w:val="1"/>
+      <w:numFmt w:val="bullet"/>
+      <w:lvlText w:val=""/>
+      <w:lvlJc w:val="left"/>
+      <w:pPr>
+        <w:ind w:left="2275" w:hanging="360"/>
+      </w:pPr>
+      <w:rPr>
+        <w:rFonts w:ascii="Wingdings" w:hAnsi="Wingdings" w:hint="default"/>
+      </w:rPr>
+    </w:lvl>
+    <w:lvl w:ilvl="3" w:tplc="04090001" w:tentative="1">
+      <w:start w:val="1"/>
+      <w:numFmt w:val="bullet"/>
+      <w:lvlText w:val=""/>
+      <w:lvlJc w:val="left"/>
+      <w:pPr>
+        <w:ind w:left="2995" w:hanging="360"/>
+      </w:pPr>
+      <w:rPr>
+        <w:rFonts w:ascii="Symbol" w:hAnsi="Symbol" w:hint="default"/>
+      </w:rPr>
+    </w:lvl>
+    <w:lvl w:ilvl="4" w:tplc="04090003" w:tentative="1">
+      <w:start w:val="1"/>
+      <w:numFmt w:val="bullet"/>
+      <w:lvlText w:val="o"/>
+      <w:lvlJc w:val="left"/>
+      <w:pPr>
+        <w:ind w:left="3715" w:hanging="360"/>
+      </w:pPr>
+      <w:rPr>
+        <w:rFonts w:ascii="Courier New" w:hAnsi="Courier New" w:cs="Courier New" w:hint="default"/>
+      </w:rPr>
+    </w:lvl>
+    <w:lvl w:ilvl="5" w:tplc="04090005" w:tentative="1">
+      <w:start w:val="1"/>
+      <w:numFmt w:val="bullet"/>
+      <w:lvlText w:val=""/>
+      <w:lvlJc w:val="left"/>
+      <w:pPr>
+        <w:ind w:left="4435" w:hanging="360"/>
+      </w:pPr>
+      <w:rPr>
+        <w:rFonts w:ascii="Wingdings" w:hAnsi="Wingdings" w:hint="default"/>
+      </w:rPr>
+    </w:lvl>
+    <w:lvl w:ilvl="6" w:tplc="04090001" w:tentative="1">
+      <w:start w:val="1"/>
+      <w:numFmt w:val="bullet"/>
+      <w:lvlText w:val=""/>
+      <w:lvlJc w:val="left"/>
+      <w:pPr>
+        <w:ind w:left="5155" w:hanging="360"/>
+      </w:pPr>
+      <w:rPr>
+        <w:rFonts w:ascii="Symbol" w:hAnsi="Symbol" w:hint="default"/>
+      </w:rPr>
+    </w:lvl>
+    <w:lvl w:ilvl="7" w:tplc="04090003" w:tentative="1">
+      <w:start w:val="1"/>
+      <w:numFmt w:val="bullet"/>
+      <w:lvlText w:val="o"/>
+      <w:lvlJc w:val="left"/>
+      <w:pPr>
+        <w:ind w:left="5875" w:hanging="360"/>
+      </w:pPr>
+      <w:rPr>
+        <w:rFonts w:ascii="Courier New" w:hAnsi="Courier New" w:cs="Courier New" w:hint="default"/>
+      </w:rPr>
+    </w:lvl>
+    <w:lvl w:ilvl="8" w:tplc="04090005" w:tentative="1">
+      <w:start w:val="1"/>
+      <w:numFmt w:val="bullet"/>
+      <w:lvlText w:val=""/>
+      <w:lvlJc w:val="left"/>
+      <w:pPr>
+        <w:ind w:left="6595" w:hanging="360"/>
+      </w:pPr>
+      <w:rPr>
+        <w:rFonts w:ascii="Wingdings" w:hAnsi="Wingdings" w:hint="default"/>
+      </w:rPr>
+    </w:lvl>
+  </w:abstractNum>
+  <w:abstractNum w:abstractNumId="11" w15:restartNumberingAfterBreak="0">
     <w:nsid w:val="7B820D77"/>
     <w:multiLevelType w:val="hybridMultilevel"/>
     <w:tmpl w:val="C1AA18D8"/>
@@ -4202,13 +5511,13 @@
     </w:lvl>
   </w:abstractNum>
   <w:num w:numId="1" w16cid:durableId="57755589">
-    <w:abstractNumId w:val="8"/>
+    <w:abstractNumId w:val="11"/>
   </w:num>
   <w:num w:numId="2" w16cid:durableId="474185449">
     <w:abstractNumId w:val="1"/>
   </w:num>
   <w:num w:numId="3" w16cid:durableId="330064531">
-    <w:abstractNumId w:val="7"/>
+    <w:abstractNumId w:val="9"/>
   </w:num>
   <w:num w:numId="4" w16cid:durableId="1329288562">
     <w:abstractNumId w:val="3"/>
@@ -4217,16 +5526,25 @@
     <w:abstractNumId w:val="0"/>
   </w:num>
   <w:num w:numId="6" w16cid:durableId="950206805">
-    <w:abstractNumId w:val="4"/>
+    <w:abstractNumId w:val="5"/>
   </w:num>
   <w:num w:numId="7" w16cid:durableId="82847711">
-    <w:abstractNumId w:val="5"/>
+    <w:abstractNumId w:val="7"/>
   </w:num>
   <w:num w:numId="8" w16cid:durableId="2055957560">
-    <w:abstractNumId w:val="6"/>
+    <w:abstractNumId w:val="8"/>
   </w:num>
   <w:num w:numId="9" w16cid:durableId="337469047">
     <w:abstractNumId w:val="2"/>
+  </w:num>
+  <w:num w:numId="10" w16cid:durableId="926115287">
+    <w:abstractNumId w:val="4"/>
+  </w:num>
+  <w:num w:numId="11" w16cid:durableId="1838811665">
+    <w:abstractNumId w:val="10"/>
+  </w:num>
+  <w:num w:numId="12" w16cid:durableId="846942351">
+    <w:abstractNumId w:val="6"/>
   </w:num>
 </w:numbering>
 </file>

</xml_diff>